<commit_message>
CNE-244: Move fee/deposit amounts to settings, add fee/deposit to PDF forms
Rental fee and deposit amounts now come from configurable settings instead
of hardcoded constants, and the wheelchair/scooter PDF forms display the
fee and deposit amounts embedded in the terms and conditions text (in
addition to the existing summary fields). The scooter form's embedded
fee/deposit fields are formatted with 2 decimal places to match the
$XX.XX style used elsewhere on the form.
</commit_message>
<xml_diff>
--- a/ui/assets/scooter_form_fillable.docx
+++ b/ui/assets/scooter_form_fillable.docx
@@ -1073,27 +1073,7 @@
           <w:sz w:val="20"/>
           <w:szCs w:val="20"/>
         </w:rPr>
-        <w:t>4</w:t>
-      </w:r>
-      <w:r>
-        <w:rPr>
-          <w:rFonts w:ascii="Aptos" w:hAnsi="Aptos"/>
-          <w:b/>
-          <w:bCs/>
-          <w:sz w:val="20"/>
-          <w:szCs w:val="20"/>
-        </w:rPr>
-        <w:t>5</w:t>
-      </w:r>
-      <w:r>
-        <w:rPr>
-          <w:rFonts w:ascii="Aptos" w:hAnsi="Aptos"/>
-          <w:b/>
-          <w:bCs/>
-          <w:sz w:val="20"/>
-          <w:szCs w:val="20"/>
-        </w:rPr>
-        <w:t>.00</w:t>
+        <w:t>________</w:t>
       </w:r>
       <w:r>
         <w:rPr>
@@ -1336,7 +1316,44 @@
           <w:sz w:val="20"/>
           <w:szCs w:val="20"/>
         </w:rPr>
-        <w:t xml:space="preserve">of $100.00 (cash or credit card) </w:t>
+        <w:t xml:space="preserve">of </w:t>
+      </w:r>
+      <w:r>
+        <w:rPr>
+          <w:rFonts w:ascii="Aptos" w:hAnsi="Aptos"/>
+          <w:b/>
+          <w:bCs/>
+          <w:sz w:val="20"/>
+          <w:szCs w:val="20"/>
+        </w:rPr>
+        <w:t>$</w:t>
+      </w:r>
+      <w:r>
+        <w:rPr>
+          <w:rFonts w:ascii="Aptos" w:hAnsi="Aptos"/>
+          <w:b/>
+          <w:bCs/>
+          <w:sz w:val="20"/>
+          <w:szCs w:val="20"/>
+        </w:rPr>
+        <w:t>________</w:t>
+      </w:r>
+      <w:r>
+        <w:rPr>
+          <w:rFonts w:ascii="Aptos" w:hAnsi="Aptos"/>
+          <w:sz w:val="20"/>
+          <w:szCs w:val="20"/>
+        </w:rPr>
+        <w:t xml:space="preserve"> </w:t>
+      </w:r>
+      <w:r>
+        <w:rPr>
+          <w:rFonts w:ascii="Aptos" w:hAnsi="Aptos"/>
+          <w:b/>
+          <w:sz w:val="20"/>
+          <w:szCs w:val="20"/>
+        </w:rPr>
+        <w:t xml:space="preserve">(cash or credit card) </w:t>
       </w:r>
       <w:r>
         <w:rPr>
@@ -1713,7 +1730,15 @@
           <w:sz w:val="24"/>
           <w:szCs w:val="24"/>
         </w:rPr>
-        <w:t xml:space="preserve"> 2025 in Toronto, Ontario</w:t>
+        <w:t xml:space="preserve"> _______</w:t>
+      </w:r>
+      <w:r>
+        <w:rPr>
+          <w:rFonts w:ascii="Aptos" w:hAnsi="Aptos"/>
+          <w:sz w:val="24"/>
+          <w:szCs w:val="24"/>
+        </w:rPr>
+        <w:t xml:space="preserve"> in Toronto, Ontario</w:t>
       </w:r>
       <w:r>
         <w:rPr>
@@ -2307,8 +2332,28 @@
                                     <w:rPr>
                                       <w:rFonts w:ascii="Aptos" w:hAnsi="Aptos"/>
                                     </w:rPr>
-                                    <w:t>DEPOSIT ($100)</w:t>
+                                    <w:t>DEPOSIT (</w:t>
                                   </w:r>
+                                  <w:r>
+                                    <w:rPr>
+                                      <w:rFonts w:ascii="Aptos" w:hAnsi="Aptos"/>
+                                    </w:rPr>
+                                    <w:t xml:space="preserve">$         </w:t>
+                                  </w:r>
+                                  <w:proofErr w:type="gramStart"/>
+                                  <w:r>
+                                    <w:rPr>
+                                      <w:rFonts w:ascii="Aptos" w:hAnsi="Aptos"/>
+                                    </w:rPr>
+                                    <w:t xml:space="preserve">  </w:t>
+                                  </w:r>
+                                  <w:r>
+                                    <w:rPr>
+                                      <w:rFonts w:ascii="Aptos" w:hAnsi="Aptos"/>
+                                    </w:rPr>
+                                    <w:t>)</w:t>
+                                  </w:r>
+                                  <w:proofErr w:type="gramEnd"/>
                                 </w:p>
                               </w:tc>
                               <w:tc>
@@ -2382,8 +2427,34 @@
                                     <w:rPr>
                                       <w:rFonts w:ascii="Aptos" w:hAnsi="Aptos"/>
                                     </w:rPr>
-                                    <w:t>FEE ($45)</w:t>
+                                    <w:t xml:space="preserve">FEE </w:t>
                                   </w:r>
+                                  <w:r>
+                                    <w:rPr>
+                                      <w:rFonts w:ascii="Aptos" w:hAnsi="Aptos"/>
+                                    </w:rPr>
+                                    <w:t>(</w:t>
+                                  </w:r>
+                                  <w:r>
+                                    <w:rPr>
+                                      <w:rFonts w:ascii="Aptos" w:hAnsi="Aptos"/>
+                                    </w:rPr>
+                                    <w:t xml:space="preserve">$         </w:t>
+                                  </w:r>
+                                  <w:proofErr w:type="gramStart"/>
+                                  <w:r>
+                                    <w:rPr>
+                                      <w:rFonts w:ascii="Aptos" w:hAnsi="Aptos"/>
+                                    </w:rPr>
+                                    <w:t xml:space="preserve">  </w:t>
+                                  </w:r>
+                                  <w:r>
+                                    <w:rPr>
+                                      <w:rFonts w:ascii="Aptos" w:hAnsi="Aptos"/>
+                                    </w:rPr>
+                                    <w:t>)</w:t>
+                                  </w:r>
+                                  <w:proofErr w:type="gramEnd"/>
                                 </w:p>
                               </w:tc>
                               <w:tc>
@@ -2469,7 +2540,11 @@
           </mc:Choice>
           <mc:Fallback>
             <w:pict>
-              <v:shape w14:anchorId="7709A630" id="Text Box 22" o:spid="_x0000_s1029" type="#_x0000_t202" style="position:absolute;margin-left:66.45pt;margin-top:11.4pt;width:403.2pt;height:67.85pt;z-index:251697152;visibility:visible;mso-wrap-style:square;mso-width-percent:0;mso-height-percent:0;mso-wrap-distance-left:9pt;mso-wrap-distance-top:0;mso-wrap-distance-right:9pt;mso-wrap-distance-bottom:0;mso-position-horizontal:absolute;mso-position-horizontal-relative:text;mso-position-vertical:absolute;mso-position-vertical-relative:text;mso-width-percent:0;mso-height-percent:0;mso-width-relative:margin;mso-height-relative:margin;v-text-anchor:top" o:gfxdata="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" fillcolor="white [3201]" strokeweight=".5pt">
+              <v:shapetype w14:anchorId="7709A630" id="_x0000_t202" coordsize="21600,21600" o:spt="202" path="m,l,21600r21600,l21600,xe">
+                <v:stroke joinstyle="miter"/>
+                <v:path gradientshapeok="t" o:connecttype="rect"/>
+              </v:shapetype>
+              <v:shape id="Text Box 22" o:spid="_x0000_s1029" type="#_x0000_t202" style="position:absolute;margin-left:66.45pt;margin-top:11.4pt;width:403.2pt;height:67.85pt;z-index:251697152;visibility:visible;mso-wrap-style:square;mso-width-percent:0;mso-height-percent:0;mso-wrap-distance-left:9pt;mso-wrap-distance-top:0;mso-wrap-distance-right:9pt;mso-wrap-distance-bottom:0;mso-position-horizontal:absolute;mso-position-horizontal-relative:text;mso-position-vertical:absolute;mso-position-vertical-relative:text;mso-width-percent:0;mso-height-percent:0;mso-width-relative:margin;mso-height-relative:margin;v-text-anchor:top" o:gfxdata="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" fillcolor="white [3201]" strokeweight=".5pt">
                 <v:textbox>
                   <w:txbxContent>
                     <w:tbl>
@@ -2580,8 +2655,28 @@
                               <w:rPr>
                                 <w:rFonts w:ascii="Aptos" w:hAnsi="Aptos"/>
                               </w:rPr>
-                              <w:t>DEPOSIT ($100)</w:t>
+                              <w:t>DEPOSIT (</w:t>
                             </w:r>
+                            <w:r>
+                              <w:rPr>
+                                <w:rFonts w:ascii="Aptos" w:hAnsi="Aptos"/>
+                              </w:rPr>
+                              <w:t xml:space="preserve">$         </w:t>
+                            </w:r>
+                            <w:proofErr w:type="gramStart"/>
+                            <w:r>
+                              <w:rPr>
+                                <w:rFonts w:ascii="Aptos" w:hAnsi="Aptos"/>
+                              </w:rPr>
+                              <w:t xml:space="preserve">  </w:t>
+                            </w:r>
+                            <w:r>
+                              <w:rPr>
+                                <w:rFonts w:ascii="Aptos" w:hAnsi="Aptos"/>
+                              </w:rPr>
+                              <w:t>)</w:t>
+                            </w:r>
+                            <w:proofErr w:type="gramEnd"/>
                           </w:p>
                         </w:tc>
                         <w:tc>
@@ -2655,8 +2750,34 @@
                               <w:rPr>
                                 <w:rFonts w:ascii="Aptos" w:hAnsi="Aptos"/>
                               </w:rPr>
-                              <w:t>FEE ($45)</w:t>
+                              <w:t xml:space="preserve">FEE </w:t>
                             </w:r>
+                            <w:r>
+                              <w:rPr>
+                                <w:rFonts w:ascii="Aptos" w:hAnsi="Aptos"/>
+                              </w:rPr>
+                              <w:t>(</w:t>
+                            </w:r>
+                            <w:r>
+                              <w:rPr>
+                                <w:rFonts w:ascii="Aptos" w:hAnsi="Aptos"/>
+                              </w:rPr>
+                              <w:t xml:space="preserve">$         </w:t>
+                            </w:r>
+                            <w:proofErr w:type="gramStart"/>
+                            <w:r>
+                              <w:rPr>
+                                <w:rFonts w:ascii="Aptos" w:hAnsi="Aptos"/>
+                              </w:rPr>
+                              <w:t xml:space="preserve">  </w:t>
+                            </w:r>
+                            <w:r>
+                              <w:rPr>
+                                <w:rFonts w:ascii="Aptos" w:hAnsi="Aptos"/>
+                              </w:rPr>
+                              <w:t>)</w:t>
+                            </w:r>
+                            <w:proofErr w:type="gramEnd"/>
                           </w:p>
                         </w:tc>
                         <w:tc>

</xml_diff>